<commit_message>
Rebuild architecture and database Word docs from current system only.
Replace legacy diagrams with current layered, ER, and review-flow figures; remove outdated HTML/PDF/PNG architecture assets.

Co-authored-by: Cursor <cursoragent@cursor.com>
</commit_message>
<xml_diff>
--- a/docs/DATABASE_STRUCTURE.docx
+++ b/docs/DATABASE_STRUCTURE.docx
@@ -4,7 +4,7 @@
   <w:body>
     <w:p>
       <w:pPr>
-        <w:spacing w:after="80"/>
+        <w:spacing w:after="60"/>
         <w:jc w:val="center"/>
       </w:pPr>
       <w:r>
@@ -15,12 +15,12 @@
           <w:sz w:val="40"/>
           <w:szCs w:val="40"/>
         </w:rPr>
-        <w:t xml:space="preserve">JUST RMS — Database Structure</w:t>
-      </w:r>
-    </w:p>
-    <w:p>
-      <w:pPr>
-        <w:spacing w:after="200"/>
+        <w:t xml:space="preserve">JUST RMS — Database Structure (Current)</w:t>
+      </w:r>
+    </w:p>
+    <w:p>
+      <w:pPr>
+        <w:spacing w:after="160"/>
         <w:jc w:val="center"/>
       </w:pPr>
       <w:r>
@@ -28,10 +28,10 @@
           <w:b/>
           <w:bCs/>
           <w:color w:val="64748B"/>
-          <w:sz w:val="24"/>
-          <w:szCs w:val="24"/>
-        </w:rPr>
-        <w:t xml:space="preserve">MongoDB collections, fields, and relationships</w:t>
+          <w:sz w:val="22"/>
+          <w:szCs w:val="22"/>
+        </w:rPr>
+        <w:t xml:space="preserve">MongoDB models in backend/src/models — current schema</w:t>
       </w:r>
     </w:p>
     <w:p>
@@ -39,38 +39,39 @@
         <w:pBdr>
           <w:bottom w:val="single" w:color="0369A1" w:sz="18" w:space="1"/>
         </w:pBdr>
-        <w:spacing w:after="280"/>
-      </w:pPr>
-    </w:p>
-    <w:p>
-      <w:pPr>
-        <w:pStyle w:val="Heading1"/>
-        <w:spacing w:after="140" w:before="280"/>
+        <w:spacing w:after="240"/>
+      </w:pPr>
+    </w:p>
+    <w:p>
+      <w:pPr>
+        <w:spacing w:after="120" w:before="260"/>
       </w:pPr>
       <w:r>
         <w:rPr>
           <w:b/>
           <w:bCs/>
           <w:color w:val="0C4A6E"/>
-        </w:rPr>
-        <w:t xml:space="preserve">1. Entity relationship diagram</w:t>
-      </w:r>
-    </w:p>
-    <w:p>
-      <w:pPr>
-        <w:spacing w:after="120"/>
-      </w:pPr>
-      <w:r>
-        <w:rPr>
-          <w:sz w:val="22"/>
-          <w:szCs w:val="22"/>
-        </w:rPr>
-        <w:t xml:space="preserve">Core chain: User → Proposal ↔ Ethics → Project → Grant/Budget/Payment → Publication. Nearly all documents are scoped by programTier (UG/PG).</w:t>
-      </w:r>
-    </w:p>
-    <w:p>
-      <w:pPr>
-        <w:spacing w:after="40" w:before="120"/>
+          <w:sz w:val="26"/>
+          <w:szCs w:val="26"/>
+        </w:rPr>
+        <w:t xml:space="preserve">1. Relationship diagram (current)</w:t>
+      </w:r>
+    </w:p>
+    <w:p>
+      <w:pPr>
+        <w:spacing w:after="100"/>
+      </w:pPr>
+      <w:r>
+        <w:rPr>
+          <w:sz w:val="22"/>
+          <w:szCs w:val="22"/>
+        </w:rPr>
+        <w:t xml:space="preserve">User → Proposal ↔ EthicsApplication; Proposal may link FundingCall; on approve → Project → Grant/Budget/Payment/PurchaseOrder/Publication/RepositoryItem; User also links ResearchGroup and ThesisGroup.</w:t>
+      </w:r>
+    </w:p>
+    <w:p>
+      <w:pPr>
+        <w:spacing w:after="40" w:before="100"/>
         <w:jc w:val="center"/>
       </w:pPr>
       <w:r>
@@ -78,7 +79,7 @@
           <wp:inline distT="0" distB="0" distL="0" distR="0">
             <wp:extent cx="5905500" cy="3324225"/>
             <wp:effectExtent t="0" r="0" b="0" l="0"/>
-            <wp:docPr id="1" name="db-erd.png" descr="db-erd.png" title="db-erd.png"/>
+            <wp:docPr id="1" name="db-current.png" descr="db-current.png" title="db-current.png"/>
             <wp:cNvGraphicFramePr>
               <a:graphicFrameLocks xmlns:a="http://schemas.openxmlformats.org/drawingml/2006/main" noChangeAspect="1"/>
             </wp:cNvGraphicFramePr>
@@ -116,7 +117,7 @@
     </w:p>
     <w:p>
       <w:pPr>
-        <w:spacing w:after="240" w:before="80"/>
+        <w:spacing w:after="200" w:before="60"/>
         <w:jc w:val="center"/>
       </w:pPr>
       <w:r>
@@ -127,218 +128,326 @@
           <w:sz w:val="18"/>
           <w:szCs w:val="18"/>
         </w:rPr>
-        <w:t xml:space="preserve">Figure 1. JUST RMS database relationships (ER overview)</w:t>
-      </w:r>
-    </w:p>
-    <w:p>
-      <w:pPr>
-        <w:pStyle w:val="Heading1"/>
-        <w:spacing w:after="140" w:before="280"/>
+        <w:t xml:space="preserve">Figure 1. Current database relationships</w:t>
+      </w:r>
+    </w:p>
+    <w:p>
+      <w:pPr>
+        <w:spacing w:after="120" w:before="260"/>
       </w:pPr>
       <w:r>
         <w:rPr>
           <w:b/>
           <w:bCs/>
           <w:color w:val="0C4A6E"/>
-        </w:rPr>
-        <w:t xml:space="preserve">2. Core collections</w:t>
-      </w:r>
-    </w:p>
-    <w:p>
-      <w:pPr>
-        <w:spacing w:after="80"/>
-        <w:ind w:left="360"/>
-      </w:pPr>
-      <w:r>
-        <w:rPr>
-          <w:sz w:val="22"/>
-          <w:szCs w:val="22"/>
-        </w:rPr>
-        <w:t xml:space="preserve">• users — accounts, roles, programTier, status</w:t>
-      </w:r>
-    </w:p>
-    <w:p>
-      <w:pPr>
-        <w:spacing w:after="80"/>
-        <w:ind w:left="360"/>
-      </w:pPr>
-      <w:r>
-        <w:rPr>
-          <w:sz w:val="22"/>
-          <w:szCs w:val="22"/>
-        </w:rPr>
-        <w:t xml:space="preserve">• proposals — reviewPipeline, assignees, proposalKind (voluntary | grant_fund_call)</w:t>
-      </w:r>
-    </w:p>
-    <w:p>
-      <w:pPr>
-        <w:spacing w:after="80"/>
-        <w:ind w:left="360"/>
-      </w:pPr>
-      <w:r>
-        <w:rPr>
-          <w:sz w:val="22"/>
-          <w:szCs w:val="22"/>
-        </w:rPr>
-        <w:t xml:space="preserve">• ethicsapplications — 1:1 with proposal; JUREC approval meta</w:t>
-      </w:r>
-    </w:p>
-    <w:p>
-      <w:pPr>
-        <w:spacing w:after="80"/>
-        <w:ind w:left="360"/>
-      </w:pPr>
-      <w:r>
-        <w:rPr>
-          <w:sz w:val="22"/>
-          <w:szCs w:val="22"/>
-        </w:rPr>
-        <w:t xml:space="preserve">• projects — created on Director approve; closure workflow</w:t>
-      </w:r>
-    </w:p>
-    <w:p>
-      <w:pPr>
-        <w:spacing w:after="80"/>
-        <w:ind w:left="360"/>
-      </w:pPr>
-      <w:r>
-        <w:rPr>
-          <w:sz w:val="22"/>
-          <w:szCs w:val="22"/>
-        </w:rPr>
-        <w:t xml:space="preserve">• fundingcalls / grants / budgets / payments / purchaseorders</w:t>
-      </w:r>
-    </w:p>
-    <w:p>
-      <w:pPr>
-        <w:spacing w:after="80"/>
-        <w:ind w:left="360"/>
-      </w:pPr>
-      <w:r>
-        <w:rPr>
-          <w:sz w:val="22"/>
-          <w:szCs w:val="22"/>
-        </w:rPr>
-        <w:t xml:space="preserve">• publications (≤1 per project), repositoryitems, researchgroups, thesisgroups</w:t>
-      </w:r>
-    </w:p>
-    <w:p>
-      <w:pPr>
-        <w:spacing w:after="80"/>
-        <w:ind w:left="360"/>
-      </w:pPr>
-      <w:r>
-        <w:rPr>
-          <w:sz w:val="22"/>
-          <w:szCs w:val="22"/>
-        </w:rPr>
-        <w:t xml:space="preserve">• departments, conversations, notifications, institutionalpolicies, auditevents</w:t>
-      </w:r>
-    </w:p>
-    <w:p>
-      <w:pPr>
-        <w:pStyle w:val="Heading1"/>
-        <w:spacing w:after="140" w:before="280"/>
+          <w:sz w:val="26"/>
+          <w:szCs w:val="26"/>
+        </w:rPr>
+        <w:t xml:space="preserve">2. Collections (18 models)</w:t>
+      </w:r>
+    </w:p>
+    <w:p>
+      <w:pPr>
+        <w:spacing w:after="70"/>
+        <w:ind w:left="280"/>
+      </w:pPr>
+      <w:r>
+        <w:rPr>
+          <w:sz w:val="22"/>
+          <w:szCs w:val="22"/>
+        </w:rPr>
+        <w:t xml:space="preserve">• users — role, programTier, status, refreshToken</w:t>
+      </w:r>
+    </w:p>
+    <w:p>
+      <w:pPr>
+        <w:spacing w:after="70"/>
+        <w:ind w:left="280"/>
+      </w:pPr>
+      <w:r>
+        <w:rPr>
+          <w:sz w:val="22"/>
+          <w:szCs w:val="22"/>
+        </w:rPr>
+        <w:t xml:space="preserve">• proposals — proposalKind, reviewPipeline, assignedReviewers, assignedCommittee, assignedFinance</w:t>
+      </w:r>
+    </w:p>
+    <w:p>
+      <w:pPr>
+        <w:spacing w:after="70"/>
+        <w:ind w:left="280"/>
+      </w:pPr>
+      <w:r>
+        <w:rPr>
+          <w:sz w:val="22"/>
+          <w:szCs w:val="22"/>
+        </w:rPr>
+        <w:t xml:space="preserve">• ethicsapplications — 1:1 proposalId, approval certificate meta</w:t>
+      </w:r>
+    </w:p>
+    <w:p>
+      <w:pPr>
+        <w:spacing w:after="70"/>
+        <w:ind w:left="280"/>
+      </w:pPr>
+      <w:r>
+        <w:rPr>
+          <w:sz w:val="22"/>
+          <w:szCs w:val="22"/>
+        </w:rPr>
+        <w:t xml:space="preserve">• projects — proposalId, closure workflow</w:t>
+      </w:r>
+    </w:p>
+    <w:p>
+      <w:pPr>
+        <w:spacing w:after="70"/>
+        <w:ind w:left="280"/>
+      </w:pPr>
+      <w:r>
+        <w:rPr>
+          <w:sz w:val="22"/>
+          <w:szCs w:val="22"/>
+        </w:rPr>
+        <w:t xml:space="preserve">• fundingcalls — open/closed calls, amountCap</w:t>
+      </w:r>
+    </w:p>
+    <w:p>
+      <w:pPr>
+        <w:spacing w:after="70"/>
+        <w:ind w:left="280"/>
+      </w:pPr>
+      <w:r>
+        <w:rPr>
+          <w:sz w:val="22"/>
+          <w:szCs w:val="22"/>
+        </w:rPr>
+        <w:t xml:space="preserve">• grants — callId, proposalId, projectId, finance status</w:t>
+      </w:r>
+    </w:p>
+    <w:p>
+      <w:pPr>
+        <w:spacing w:after="70"/>
+        <w:ind w:left="280"/>
+      </w:pPr>
+      <w:r>
+        <w:rPr>
+          <w:sz w:val="22"/>
+          <w:szCs w:val="22"/>
+        </w:rPr>
+        <w:t xml:space="preserve">• budgets — grantId/projectId, items[]</w:t>
+      </w:r>
+    </w:p>
+    <w:p>
+      <w:pPr>
+        <w:spacing w:after="70"/>
+        <w:ind w:left="280"/>
+      </w:pPr>
+      <w:r>
+        <w:rPr>
+          <w:sz w:val="22"/>
+          <w:szCs w:val="22"/>
+        </w:rPr>
+        <w:t xml:space="preserve">• payments — budgetId, approval/pay actors</w:t>
+      </w:r>
+    </w:p>
+    <w:p>
+      <w:pPr>
+        <w:spacing w:after="70"/>
+        <w:ind w:left="280"/>
+      </w:pPr>
+      <w:r>
+        <w:rPr>
+          <w:sz w:val="22"/>
+          <w:szCs w:val="22"/>
+        </w:rPr>
+        <w:t xml:space="preserve">• purchaseorders — procurement path</w:t>
+      </w:r>
+    </w:p>
+    <w:p>
+      <w:pPr>
+        <w:spacing w:after="70"/>
+        <w:ind w:left="280"/>
+      </w:pPr>
+      <w:r>
+        <w:rPr>
+          <w:sz w:val="22"/>
+          <w:szCs w:val="22"/>
+        </w:rPr>
+        <w:t xml:space="preserve">• publications — projectId unique sparse (≤1 per project)</w:t>
+      </w:r>
+    </w:p>
+    <w:p>
+      <w:pPr>
+        <w:spacing w:after="70"/>
+        <w:ind w:left="280"/>
+      </w:pPr>
+      <w:r>
+        <w:rPr>
+          <w:sz w:val="22"/>
+          <w:szCs w:val="22"/>
+        </w:rPr>
+        <w:t xml:space="preserve">• repositoryitems — project/group access</w:t>
+      </w:r>
+    </w:p>
+    <w:p>
+      <w:pPr>
+        <w:spacing w:after="70"/>
+        <w:ind w:left="280"/>
+      </w:pPr>
+      <w:r>
+        <w:rPr>
+          <w:sz w:val="22"/>
+          <w:szCs w:val="22"/>
+        </w:rPr>
+        <w:t xml:space="preserve">• departments, researchgroups, thesisgroups</w:t>
+      </w:r>
+    </w:p>
+    <w:p>
+      <w:pPr>
+        <w:spacing w:after="70"/>
+        <w:ind w:left="280"/>
+      </w:pPr>
+      <w:r>
+        <w:rPr>
+          <w:sz w:val="22"/>
+          <w:szCs w:val="22"/>
+        </w:rPr>
+        <w:t xml:space="preserve">• conversations, notifications, institutionalpolicies, auditevents</w:t>
+      </w:r>
+    </w:p>
+    <w:p>
+      <w:pPr>
+        <w:spacing w:after="120" w:before="260"/>
       </w:pPr>
       <w:r>
         <w:rPr>
           <w:b/>
           <w:bCs/>
           <w:color w:val="0C4A6E"/>
-        </w:rPr>
-        <w:t xml:space="preserve">3. Proposal review fields</w:t>
-      </w:r>
-    </w:p>
-    <w:p>
-      <w:pPr>
-        <w:spacing w:after="120"/>
-      </w:pPr>
-      <w:r>
-        <w:rPr>
-          <w:sz w:val="22"/>
-          <w:szCs w:val="22"/>
-        </w:rPr>
-        <w:t xml:space="preserve">proposals.assignedReviewers, assignedCommittee, assignedFinance store User refs. reviewPipeline stages: adminScreening, peerReview, committeeReview, financeReview (pending | in_progress | passed | failed | skipped).</w:t>
-      </w:r>
-    </w:p>
-    <w:p>
-      <w:pPr>
-        <w:pStyle w:val="Heading1"/>
-        <w:spacing w:after="140" w:before="280"/>
+          <w:sz w:val="26"/>
+          <w:szCs w:val="26"/>
+        </w:rPr>
+        <w:t xml:space="preserve">3. Proposal review fields (current)</w:t>
+      </w:r>
+    </w:p>
+    <w:p>
+      <w:pPr>
+        <w:spacing w:after="70"/>
+        <w:ind w:left="280"/>
+      </w:pPr>
+      <w:r>
+        <w:rPr>
+          <w:sz w:val="22"/>
+          <w:szCs w:val="22"/>
+        </w:rPr>
+        <w:t xml:space="preserve">• assignedReviewers[] — Leadership peer assignees</w:t>
+      </w:r>
+    </w:p>
+    <w:p>
+      <w:pPr>
+        <w:spacing w:after="70"/>
+        <w:ind w:left="280"/>
+      </w:pPr>
+      <w:r>
+        <w:rPr>
+          <w:sz w:val="22"/>
+          <w:szCs w:val="22"/>
+        </w:rPr>
+        <w:t xml:space="preserve">• assignedCommittee[] — Faculty Coordinator assignees</w:t>
+      </w:r>
+    </w:p>
+    <w:p>
+      <w:pPr>
+        <w:spacing w:after="70"/>
+        <w:ind w:left="280"/>
+      </w:pPr>
+      <w:r>
+        <w:rPr>
+          <w:sz w:val="22"/>
+          <w:szCs w:val="22"/>
+        </w:rPr>
+        <w:t xml:space="preserve">• assignedFinance[] — Finance Officer assignees (grant only)</w:t>
+      </w:r>
+    </w:p>
+    <w:p>
+      <w:pPr>
+        <w:spacing w:after="70"/>
+        <w:ind w:left="280"/>
+      </w:pPr>
+      <w:r>
+        <w:rPr>
+          <w:sz w:val="22"/>
+          <w:szCs w:val="22"/>
+        </w:rPr>
+        <w:t xml:space="preserve">• reviewPipeline: peerReview, committeeReview, financeReview (+ adminScreening auto-passed on assign)</w:t>
+      </w:r>
+    </w:p>
+    <w:p>
+      <w:pPr>
+        <w:spacing w:after="70"/>
+        <w:ind w:left="280"/>
+      </w:pPr>
+      <w:r>
+        <w:rPr>
+          <w:sz w:val="22"/>
+          <w:szCs w:val="22"/>
+        </w:rPr>
+        <w:t xml:space="preserve">• proposalKind: voluntary | grant_fund_call</w:t>
+      </w:r>
+    </w:p>
+    <w:p>
+      <w:pPr>
+        <w:spacing w:after="120" w:before="260"/>
       </w:pPr>
       <w:r>
         <w:rPr>
           <w:b/>
           <w:bCs/>
           <w:color w:val="0C4A6E"/>
-        </w:rPr>
-        <w:t xml:space="preserve">4. Status examples</w:t>
-      </w:r>
-    </w:p>
-    <w:p>
-      <w:pPr>
-        <w:spacing w:after="80"/>
-        <w:ind w:left="360"/>
-      </w:pPr>
-      <w:r>
-        <w:rPr>
-          <w:sz w:val="22"/>
-          <w:szCs w:val="22"/>
-        </w:rPr>
-        <w:t xml:space="preserve">• Proposal: draft | submitted | under_review | approved | rejected | revision_requested</w:t>
-      </w:r>
-    </w:p>
-    <w:p>
-      <w:pPr>
-        <w:spacing w:after="80"/>
-        <w:ind w:left="360"/>
-      </w:pPr>
-      <w:r>
-        <w:rPr>
-          <w:sz w:val="22"/>
-          <w:szCs w:val="22"/>
-        </w:rPr>
-        <w:t xml:space="preserve">• Project: active | completed | on_hold | closing | closed</w:t>
-      </w:r>
-    </w:p>
-    <w:p>
-      <w:pPr>
-        <w:spacing w:after="80"/>
-        <w:ind w:left="360"/>
-      </w:pPr>
-      <w:r>
-        <w:rPr>
-          <w:sz w:val="22"/>
-          <w:szCs w:val="22"/>
-        </w:rPr>
-        <w:t xml:space="preserve">• Grant: draft | submitted | pending_finance | approved | active | closed | rejected</w:t>
-      </w:r>
-    </w:p>
-    <w:p>
-      <w:pPr>
-        <w:pStyle w:val="Heading1"/>
-        <w:spacing w:after="140" w:before="280"/>
+          <w:sz w:val="26"/>
+          <w:szCs w:val="26"/>
+        </w:rPr>
+        <w:t xml:space="preserve">4. programTier scoping</w:t>
+      </w:r>
+    </w:p>
+    <w:p>
+      <w:pPr>
+        <w:spacing w:after="100"/>
+      </w:pPr>
+      <w:r>
+        <w:rPr>
+          <w:sz w:val="22"/>
+          <w:szCs w:val="22"/>
+        </w:rPr>
+        <w:t xml:space="preserve">Almost every business document stores programTier. Researchers are locked to their tier. Shared staff switch portal via X-Program-Tier without separate UG/PG accounts.</w:t>
+      </w:r>
+    </w:p>
+    <w:p>
+      <w:pPr>
+        <w:spacing w:after="120" w:before="260"/>
       </w:pPr>
       <w:r>
         <w:rPr>
           <w:b/>
           <w:bCs/>
           <w:color w:val="0C4A6E"/>
-        </w:rPr>
-        <w:t xml:space="preserve">5. Module map (visual)</w:t>
-      </w:r>
-    </w:p>
-    <w:p>
-      <w:pPr>
-        <w:spacing w:after="40" w:before="120"/>
+          <w:sz w:val="26"/>
+          <w:szCs w:val="26"/>
+        </w:rPr>
+        <w:t xml:space="preserve">5. Review flow reminder</w:t>
+      </w:r>
+    </w:p>
+    <w:p>
+      <w:pPr>
+        <w:spacing w:after="40" w:before="100"/>
         <w:jc w:val="center"/>
       </w:pPr>
       <w:r>
         <w:drawing>
           <wp:inline distT="0" distB="0" distL="0" distR="0">
-            <wp:extent cx="5524500" cy="3429000"/>
+            <wp:extent cx="5905500" cy="3324225"/>
             <wp:effectExtent t="0" r="0" b="0" l="0"/>
-            <wp:docPr id="1" name="JUST-RMS-All-Modules.png" descr="JUST-RMS-All-Modules.png" title="JUST-RMS-All-Modules.png"/>
+            <wp:docPr id="1" name="flow-current.png" descr="flow-current.png" title="flow-current.png"/>
             <wp:cNvGraphicFramePr>
               <a:graphicFrameLocks xmlns:a="http://schemas.openxmlformats.org/drawingml/2006/main" noChangeAspect="1"/>
             </wp:cNvGraphicFramePr>
@@ -361,7 +470,7 @@
                   <pic:spPr bwMode="auto">
                     <a:xfrm>
                       <a:off x="0" y="0"/>
-                      <a:ext cx="5524500" cy="3429000"/>
+                      <a:ext cx="5905500" cy="3324225"/>
                     </a:xfrm>
                     <a:prstGeom prst="rect">
                       <a:avLst/>
@@ -376,7 +485,7 @@
     </w:p>
     <w:p>
       <w:pPr>
-        <w:spacing w:after="240" w:before="80"/>
+        <w:spacing w:after="200" w:before="60"/>
         <w:jc w:val="center"/>
       </w:pPr>
       <w:r>
@@ -387,69 +496,7 @@
           <w:sz w:val="18"/>
           <w:szCs w:val="18"/>
         </w:rPr>
-        <w:t xml:space="preserve">Figure 2. Modules mapped across the system</w:t>
-      </w:r>
-    </w:p>
-    <w:p>
-      <w:pPr>
-        <w:spacing w:after="40" w:before="120"/>
-        <w:jc w:val="center"/>
-      </w:pPr>
-      <w:r>
-        <w:drawing>
-          <wp:inline distT="0" distB="0" distL="0" distR="0">
-            <wp:extent cx="5524500" cy="3429000"/>
-            <wp:effectExtent t="0" r="0" b="0" l="0"/>
-            <wp:docPr id="1" name="JUST-RMS-Connections-Diagram.png" descr="JUST-RMS-Connections-Diagram.png" title="JUST-RMS-Connections-Diagram.png"/>
-            <wp:cNvGraphicFramePr>
-              <a:graphicFrameLocks xmlns:a="http://schemas.openxmlformats.org/drawingml/2006/main" noChangeAspect="1"/>
-            </wp:cNvGraphicFramePr>
-            <a:graphic xmlns:a="http://schemas.openxmlformats.org/drawingml/2006/main">
-              <a:graphicData uri="http://schemas.openxmlformats.org/drawingml/2006/picture">
-                <pic:pic xmlns:pic="http://schemas.openxmlformats.org/drawingml/2006/picture">
-                  <pic:nvPicPr>
-                    <pic:cNvPr id="0" name="" descr=""/>
-                    <pic:cNvPicPr>
-                      <a:picLocks noChangeAspect="1" noChangeArrowheads="1"/>
-                    </pic:cNvPicPr>
-                  </pic:nvPicPr>
-                  <pic:blipFill>
-                    <a:blip r:embed="rId9" cstate="none"/>
-                    <a:srcRect/>
-                    <a:stretch>
-                      <a:fillRect/>
-                    </a:stretch>
-                  </pic:blipFill>
-                  <pic:spPr bwMode="auto">
-                    <a:xfrm>
-                      <a:off x="0" y="0"/>
-                      <a:ext cx="5524500" cy="3429000"/>
-                    </a:xfrm>
-                    <a:prstGeom prst="rect">
-                      <a:avLst/>
-                    </a:prstGeom>
-                  </pic:spPr>
-                </pic:pic>
-              </a:graphicData>
-            </a:graphic>
-          </wp:inline>
-        </w:drawing>
-      </w:r>
-    </w:p>
-    <w:p>
-      <w:pPr>
-        <w:spacing w:after="240" w:before="80"/>
-        <w:jc w:val="center"/>
-      </w:pPr>
-      <w:r>
-        <w:rPr>
-          <w:i/>
-          <w:iCs/>
-          <w:color w:val="64748B"/>
-          <w:sz w:val="18"/>
-          <w:szCs w:val="18"/>
-        </w:rPr>
-        <w:t xml:space="preserve">Figure 3. Data / module connections</w:t>
+        <w:t xml:space="preserve">Figure 2. Current review flow (same as architecture doc)</w:t>
       </w:r>
     </w:p>
     <w:sectPr>

</xml_diff>